<commit_message>
update: ganti file cv terbaru
</commit_message>
<xml_diff>
--- a/cv/Khairul_Raihan_Hidayat_CV_ATS.docx
+++ b/cv/Khairul_Raihan_Hidayat_CV_ATS.docx
@@ -25,19 +25,12 @@
         <w:br/>
       </w:r>
       <w:hyperlink r:id="rId6" w:history="1">
-        <w:proofErr w:type="spellStart"/>
         <w:r>
           <w:rPr>
-            <w:rStyle w:val="Hyperlink"/>
+            <w:color w:val="0000FF"/>
+            <w:u w:val="single"/>
           </w:rPr>
-          <w:t>Portofolio</w:t>
-        </w:r>
-        <w:proofErr w:type="spellEnd"/>
-        <w:r>
-          <w:rPr>
-            <w:rStyle w:val="Hyperlink"/>
-          </w:rPr>
-          <w:t xml:space="preserve"> Khairul Raihan Hidayat</w:t>
+          <w:t>Khairul Raihan Hidayat | profile</w:t>
         </w:r>
       </w:hyperlink>
     </w:p>
@@ -108,7 +101,31 @@
       </w:r>
       <w:proofErr w:type="spellEnd"/>
       <w:r>
-        <w:t xml:space="preserve">, dan analisis data menggunakan Python dan SQL, serta merancang dasbor interaktif menggunakan Tableau dan Looker Studio. Siap untuk berkontribusi </w:t>
+        <w:t xml:space="preserve">, dan analisis data menggunakan Python dan SQL, serta merancang dasbor interaktif menggunakan Tableau dan Looker Studio. </w:t>
+      </w:r>
+      <w:proofErr w:type="spellStart"/>
+      <w:r>
+        <w:t>Siap</w:t>
+      </w:r>
+      <w:proofErr w:type="spellEnd"/>
+      <w:r>
+        <w:t xml:space="preserve"> </w:t>
+      </w:r>
+      <w:proofErr w:type="spellStart"/>
+      <w:r>
+        <w:t>untuk</w:t>
+      </w:r>
+      <w:proofErr w:type="spellEnd"/>
+      <w:r>
+        <w:t xml:space="preserve"> </w:t>
+      </w:r>
+      <w:proofErr w:type="spellStart"/>
+      <w:r>
+        <w:t>berkontribusi</w:t>
+      </w:r>
+      <w:proofErr w:type="spellEnd"/>
+      <w:r>
+        <w:t xml:space="preserve"> </w:t>
       </w:r>
       <w:proofErr w:type="spellStart"/>
       <w:r>

</xml_diff>